<commit_message>
Report: remove team-name placeholder
Co-Authored-By: Claude Opus 5.5 <noreply@anthropic.com>
</commit_message>
<xml_diff>
--- a/report/BT4012_Report.docx
+++ b/report/BT4012_Report.docx
@@ -26,31 +26,22 @@
           <w:sz w:val="21"/>
           <w:szCs w:val="21"/>
         </w:rPr>
-        <w:t xml:space="preserve">BT4012 Fraud Analytics — Competition Report · Tim Chua Siam Mgian · A0273128E · Kaggle team: </w:t>
-      </w:r>
+        <w:t xml:space="preserve">BT4012 Fraud Analytics — Competition Report · Tim Chua Siam Mgian · A0273128E</w:t>
+      </w:r>
+    </w:p>
+    <w:p>
+      <w:pPr>
+        <w:spacing w:after="20"/>
+      </w:pPr>
       <w:r>
         <w:rPr>
           <w:color w:val="52514E"/>
           <w:sz w:val="21"/>
           <w:szCs w:val="21"/>
-          <w:highlight w:val="yellow"/>
-        </w:rPr>
-        <w:t xml:space="preserve">[Team name]</w:t>
-      </w:r>
-    </w:p>
-    <w:p>
-      <w:pPr>
-        <w:spacing w:after="20"/>
-      </w:pPr>
-      <w:r>
-        <w:rPr>
-          <w:color w:val="52514E"/>
-          <w:sz w:val="21"/>
-          <w:szCs w:val="21"/>
         </w:rPr>
         <w:t xml:space="preserve">Code: </w:t>
       </w:r>
-      <w:hyperlink w:history="1" r:id="rId5bmz1ainbmcpys1b2fyfv">
+      <w:hyperlink w:history="1" r:id="rIdxsr5oa2p9zqr0nauc2j34">
         <w:r>
           <w:rPr>
             <w:rStyle w:val="Hyperlink"/>
@@ -1975,7 +1966,7 @@
       <w:r>
         <w:t xml:space="preserve"> at </w:t>
       </w:r>
-      <w:hyperlink w:history="1" r:id="rIdlt-faf7lm95yl48_ecwp2">
+      <w:hyperlink w:history="1" r:id="rIdaqcwvrkbxosbw4ml9sw2f">
         <w:r>
           <w:rPr>
             <w:rStyle w:val="Hyperlink"/>

</xml_diff>

<commit_message>
Report: describe validation as temporal hold-out, no k-fold
Co-Authored-By: Claude Opus 5.5 <noreply@anthropic.com>
</commit_message>
<xml_diff>
--- a/report/BT4012_Report.docx
+++ b/report/BT4012_Report.docx
@@ -41,7 +41,7 @@
         </w:rPr>
         <w:t xml:space="preserve">Code: </w:t>
       </w:r>
-      <w:hyperlink w:history="1" r:id="rIdxsr5oa2p9zqr0nauc2j34">
+      <w:hyperlink w:history="1" r:id="rIdq3izjcrnjgvlf2-srtlvm">
         <w:r>
           <w:rPr>
             <w:rStyle w:val="Hyperlink"/>
@@ -391,10 +391,10 @@
           <w:b/>
           <w:bCs/>
         </w:rPr>
-        <w:t xml:space="preserve">Temporal validation.</w:t>
-      </w:r>
-      <w:r>
-        <w:t xml:space="preserve"> Random cross-validation would let future transactions inform predictions about the past, so every split respects time order. The </w:t>
+        <w:t xml:space="preserve">Temporal hold-out validation.</w:t>
+      </w:r>
+      <w:r>
+        <w:t xml:space="preserve"> We never used k-fold cross-validation: random folds would train on later transactions and score on earlier ones, leaking future information into validation. Instead, every model was trained on earlier time steps and validated on a single, later hold-out window. The </w:t>
       </w:r>
       <w:r>
         <w:rPr>
@@ -414,18 +414,7 @@
         <w:t xml:space="preserve">gap-matched split</w:t>
       </w:r>
       <w:r>
-        <w:t xml:space="preserve"> trains on 1–20 and validates on 30–35, mimicking the 1–14 step distance between training and test. Random Forest's grid search used a </w:t>
-      </w:r>
-      <w:r>
-        <w:rPr>
-          <w:rFonts w:ascii="Consolas" w:cs="Consolas" w:eastAsia="Consolas" w:hAnsi="Consolas"/>
-          <w:sz w:val="20"/>
-          <w:szCs w:val="20"/>
-        </w:rPr>
-        <w:t xml:space="preserve">PredefinedSplit</w:t>
-      </w:r>
-      <w:r>
-        <w:t xml:space="preserve"> so that its single fold also respected time.</w:t>
+        <w:t xml:space="preserve"> trains on 1–20 and validates on 30–35, mimicking the 1–14 step distance between training and test.</w:t>
       </w:r>
     </w:p>
     <w:p>
@@ -1966,7 +1955,7 @@
       <w:r>
         <w:t xml:space="preserve"> at </w:t>
       </w:r>
-      <w:hyperlink w:history="1" r:id="rIdaqcwvrkbxosbw4ml9sw2f">
+      <w:hyperlink w:history="1" r:id="rIdm4dzwmik0bpmojsqg_dlb">
         <w:r>
           <w:rPr>
             <w:rStyle w:val="Hyperlink"/>

</xml_diff>

<commit_message>
Report: explain the adjacent and gap-matched splits
Co-Authored-By: Claude Opus 5.5 <noreply@anthropic.com>
</commit_message>
<xml_diff>
--- a/report/BT4012_Report.docx
+++ b/report/BT4012_Report.docx
@@ -41,7 +41,7 @@
         </w:rPr>
         <w:t xml:space="preserve">Code: </w:t>
       </w:r>
-      <w:hyperlink w:history="1" r:id="rIdq3izjcrnjgvlf2-srtlvm">
+      <w:hyperlink w:history="1" r:id="rIdn2d0gtok-zlasx__q2n2k">
         <w:r>
           <w:rPr>
             <w:rStyle w:val="Hyperlink"/>
@@ -394,27 +394,47 @@
         <w:t xml:space="preserve">Temporal hold-out validation.</w:t>
       </w:r>
       <w:r>
-        <w:t xml:space="preserve"> We never used k-fold cross-validation: random folds would train on later transactions and score on earlier ones, leaking future information into validation. Instead, every model was trained on earlier time steps and validated on a single, later hold-out window. The </w:t>
-      </w:r>
-      <w:r>
-        <w:rPr>
-          <w:b/>
-          <w:bCs/>
-        </w:rPr>
-        <w:t xml:space="preserve">adjacent split</w:t>
-      </w:r>
-      <w:r>
-        <w:t xml:space="preserve"> trains on steps 1–30 and validates on 31–35; the </w:t>
-      </w:r>
-      <w:r>
-        <w:rPr>
-          <w:b/>
-          <w:bCs/>
-        </w:rPr>
-        <w:t xml:space="preserve">gap-matched split</w:t>
-      </w:r>
-      <w:r>
-        <w:t xml:space="preserve"> trains on 1–20 and validates on 30–35, mimicking the 1–14 step distance between training and test.</w:t>
+        <w:t xml:space="preserve"> We never used k-fold cross-validation: random folds would train on later transactions and score on earlier ones, leaking future information into validation. Instead, every model was trained on earlier time steps and validated on a single, later hold-out window, using two splits:</w:t>
+      </w:r>
+    </w:p>
+    <w:p>
+      <w:pPr>
+        <w:pStyle w:val="ListParagraph"/>
+        <w:numPr>
+          <w:ilvl w:val="0"/>
+          <w:numId w:val="2"/>
+        </w:numPr>
+        <w:spacing w:after="30" w:line="240"/>
+      </w:pPr>
+      <w:r>
+        <w:rPr>
+          <w:b/>
+          <w:bCs/>
+        </w:rPr>
+        <w:t xml:space="preserve">Adjacent split</w:t>
+      </w:r>
+      <w:r>
+        <w:t xml:space="preserve"> (train on steps 1–30, validate on 31–35). The validation window starts right after training, so it tests predictions only 1–5 steps ahead. We used it to compare the baseline models.</w:t>
+      </w:r>
+    </w:p>
+    <w:p>
+      <w:pPr>
+        <w:pStyle w:val="ListParagraph"/>
+        <w:numPr>
+          <w:ilvl w:val="0"/>
+          <w:numId w:val="2"/>
+        </w:numPr>
+        <w:spacing w:after="30" w:line="240"/>
+      </w:pPr>
+      <w:r>
+        <w:rPr>
+          <w:b/>
+          <w:bCs/>
+        </w:rPr>
+        <w:t xml:space="preserve">Gap-matched split</w:t>
+      </w:r>
+      <w:r>
+        <w:t xml:space="preserve"> (train on steps 1–20, validate on 30–35). The 10-step gap means it tests predictions 10–15 steps ahead, closer to the real task, where test transactions lie 1–14 steps after training. We added it because the adjacent split proved far too optimistic: our first model scored ROC-AUC 0.998 on it but 0.940 on the leaderboard, and almost every setting scored ≈ 0.998, leaving no room to tell them apart. The gap exposes models to the drift they face at test time, so it was used to choose the recency weighting, hyperparameters and features.</w:t>
       </w:r>
     </w:p>
     <w:p>
@@ -583,6 +603,7 @@
       </w:tblGrid>
       <w:tr>
         <w:trPr>
+          <w:cantSplit/>
           <w:tblHeader/>
         </w:trPr>
         <w:tc>
@@ -603,6 +624,9 @@
             </w:tcMar>
           </w:tcPr>
           <w:p>
+            <w:pPr>
+              <w:keepNext/>
+            </w:pPr>
             <w:r>
               <w:rPr>
                 <w:b/>
@@ -632,6 +656,9 @@
             </w:tcMar>
           </w:tcPr>
           <w:p>
+            <w:pPr>
+              <w:keepNext/>
+            </w:pPr>
             <w:r>
               <w:rPr>
                 <w:b/>
@@ -661,6 +688,9 @@
             </w:tcMar>
           </w:tcPr>
           <w:p>
+            <w:pPr>
+              <w:keepNext/>
+            </w:pPr>
             <w:r>
               <w:rPr>
                 <w:b/>
@@ -690,6 +720,9 @@
             </w:tcMar>
           </w:tcPr>
           <w:p>
+            <w:pPr>
+              <w:keepNext/>
+            </w:pPr>
             <w:r>
               <w:rPr>
                 <w:b/>
@@ -703,6 +736,9 @@
         </w:tc>
       </w:tr>
       <w:tr>
+        <w:trPr>
+          <w:cantSplit/>
+        </w:trPr>
         <w:tc>
           <w:tcPr>
             <w:tcW w:type="dxa" w:w="3638"/>
@@ -720,6 +756,9 @@
             </w:tcMar>
           </w:tcPr>
           <w:p>
+            <w:pPr>
+              <w:keepNext/>
+            </w:pPr>
             <w:r>
               <w:rPr>
                 <w:b/>
@@ -748,6 +787,9 @@
             </w:tcMar>
           </w:tcPr>
           <w:p>
+            <w:pPr>
+              <w:keepNext/>
+            </w:pPr>
             <w:r>
               <w:rPr>
                 <w:sz w:val="18"/>
@@ -774,6 +816,9 @@
             </w:tcMar>
           </w:tcPr>
           <w:p>
+            <w:pPr>
+              <w:keepNext/>
+            </w:pPr>
             <w:r>
               <w:rPr>
                 <w:sz w:val="18"/>
@@ -800,6 +845,9 @@
             </w:tcMar>
           </w:tcPr>
           <w:p>
+            <w:pPr>
+              <w:keepNext/>
+            </w:pPr>
             <w:r>
               <w:rPr>
                 <w:b/>
@@ -813,6 +861,9 @@
         </w:tc>
       </w:tr>
       <w:tr>
+        <w:trPr>
+          <w:cantSplit/>
+        </w:trPr>
         <w:tc>
           <w:tcPr>
             <w:tcW w:type="dxa" w:w="3638"/>
@@ -830,6 +881,9 @@
             </w:tcMar>
           </w:tcPr>
           <w:p>
+            <w:pPr>
+              <w:keepNext/>
+            </w:pPr>
             <w:r>
               <w:rPr>
                 <w:sz w:val="18"/>
@@ -856,6 +910,9 @@
             </w:tcMar>
           </w:tcPr>
           <w:p>
+            <w:pPr>
+              <w:keepNext/>
+            </w:pPr>
             <w:r>
               <w:rPr>
                 <w:sz w:val="18"/>
@@ -882,6 +939,9 @@
             </w:tcMar>
           </w:tcPr>
           <w:p>
+            <w:pPr>
+              <w:keepNext/>
+            </w:pPr>
             <w:r>
               <w:rPr>
                 <w:sz w:val="18"/>
@@ -908,6 +968,9 @@
             </w:tcMar>
           </w:tcPr>
           <w:p>
+            <w:pPr>
+              <w:keepNext/>
+            </w:pPr>
             <w:r>
               <w:rPr>
                 <w:sz w:val="18"/>
@@ -919,6 +982,9 @@
         </w:tc>
       </w:tr>
       <w:tr>
+        <w:trPr>
+          <w:cantSplit/>
+        </w:trPr>
         <w:tc>
           <w:tcPr>
             <w:tcW w:type="dxa" w:w="3638"/>
@@ -936,6 +1002,9 @@
             </w:tcMar>
           </w:tcPr>
           <w:p>
+            <w:pPr>
+              <w:keepNext/>
+            </w:pPr>
             <w:r>
               <w:rPr>
                 <w:sz w:val="18"/>
@@ -962,6 +1031,9 @@
             </w:tcMar>
           </w:tcPr>
           <w:p>
+            <w:pPr>
+              <w:keepNext/>
+            </w:pPr>
             <w:r>
               <w:rPr>
                 <w:sz w:val="18"/>
@@ -988,6 +1060,9 @@
             </w:tcMar>
           </w:tcPr>
           <w:p>
+            <w:pPr>
+              <w:keepNext/>
+            </w:pPr>
             <w:r>
               <w:rPr>
                 <w:sz w:val="18"/>
@@ -1014,6 +1089,9 @@
             </w:tcMar>
           </w:tcPr>
           <w:p>
+            <w:pPr>
+              <w:keepNext/>
+            </w:pPr>
             <w:r>
               <w:rPr>
                 <w:sz w:val="18"/>
@@ -1025,6 +1103,9 @@
         </w:tc>
       </w:tr>
       <w:tr>
+        <w:trPr>
+          <w:cantSplit/>
+        </w:trPr>
         <w:tc>
           <w:tcPr>
             <w:tcW w:type="dxa" w:w="3638"/>
@@ -1042,6 +1123,9 @@
             </w:tcMar>
           </w:tcPr>
           <w:p>
+            <w:pPr>
+              <w:keepNext/>
+            </w:pPr>
             <w:r>
               <w:rPr>
                 <w:sz w:val="18"/>
@@ -1068,6 +1152,9 @@
             </w:tcMar>
           </w:tcPr>
           <w:p>
+            <w:pPr>
+              <w:keepNext/>
+            </w:pPr>
             <w:r>
               <w:rPr>
                 <w:sz w:val="18"/>
@@ -1094,6 +1181,9 @@
             </w:tcMar>
           </w:tcPr>
           <w:p>
+            <w:pPr>
+              <w:keepNext/>
+            </w:pPr>
             <w:r>
               <w:rPr>
                 <w:sz w:val="18"/>
@@ -1120,6 +1210,9 @@
             </w:tcMar>
           </w:tcPr>
           <w:p>
+            <w:pPr>
+              <w:keepNext/>
+            </w:pPr>
             <w:r>
               <w:rPr>
                 <w:sz w:val="18"/>
@@ -1131,6 +1224,9 @@
         </w:tc>
       </w:tr>
       <w:tr>
+        <w:trPr>
+          <w:cantSplit/>
+        </w:trPr>
         <w:tc>
           <w:tcPr>
             <w:tcW w:type="dxa" w:w="3638"/>
@@ -1148,6 +1244,9 @@
             </w:tcMar>
           </w:tcPr>
           <w:p>
+            <w:pPr>
+              <w:keepNext/>
+            </w:pPr>
             <w:r>
               <w:rPr>
                 <w:sz w:val="18"/>
@@ -1174,6 +1273,9 @@
             </w:tcMar>
           </w:tcPr>
           <w:p>
+            <w:pPr>
+              <w:keepNext/>
+            </w:pPr>
             <w:r>
               <w:rPr>
                 <w:sz w:val="18"/>
@@ -1200,6 +1302,9 @@
             </w:tcMar>
           </w:tcPr>
           <w:p>
+            <w:pPr>
+              <w:keepNext/>
+            </w:pPr>
             <w:r>
               <w:rPr>
                 <w:sz w:val="18"/>
@@ -1226,6 +1331,9 @@
             </w:tcMar>
           </w:tcPr>
           <w:p>
+            <w:pPr>
+              <w:keepNext/>
+            </w:pPr>
             <w:r>
               <w:rPr>
                 <w:sz w:val="18"/>
@@ -1237,6 +1345,9 @@
         </w:tc>
       </w:tr>
       <w:tr>
+        <w:trPr>
+          <w:cantSplit/>
+        </w:trPr>
         <w:tc>
           <w:tcPr>
             <w:tcW w:type="dxa" w:w="3638"/>
@@ -1254,6 +1365,9 @@
             </w:tcMar>
           </w:tcPr>
           <w:p>
+            <w:pPr>
+              <w:keepNext/>
+            </w:pPr>
             <w:r>
               <w:rPr>
                 <w:sz w:val="18"/>
@@ -1280,6 +1394,9 @@
             </w:tcMar>
           </w:tcPr>
           <w:p>
+            <w:pPr>
+              <w:keepNext/>
+            </w:pPr>
             <w:r>
               <w:rPr>
                 <w:sz w:val="18"/>
@@ -1306,6 +1423,9 @@
             </w:tcMar>
           </w:tcPr>
           <w:p>
+            <w:pPr>
+              <w:keepNext/>
+            </w:pPr>
             <w:r>
               <w:rPr>
                 <w:sz w:val="18"/>
@@ -1332,6 +1452,9 @@
             </w:tcMar>
           </w:tcPr>
           <w:p>
+            <w:pPr>
+              <w:keepNext/>
+            </w:pPr>
             <w:r>
               <w:rPr>
                 <w:sz w:val="18"/>
@@ -1343,6 +1466,9 @@
         </w:tc>
       </w:tr>
       <w:tr>
+        <w:trPr>
+          <w:cantSplit/>
+        </w:trPr>
         <w:tc>
           <w:tcPr>
             <w:tcW w:type="dxa" w:w="3638"/>
@@ -1360,6 +1486,9 @@
             </w:tcMar>
           </w:tcPr>
           <w:p>
+            <w:pPr>
+              <w:keepNext/>
+            </w:pPr>
             <w:r>
               <w:rPr>
                 <w:sz w:val="18"/>
@@ -1386,6 +1515,9 @@
             </w:tcMar>
           </w:tcPr>
           <w:p>
+            <w:pPr>
+              <w:keepNext/>
+            </w:pPr>
             <w:r>
               <w:rPr>
                 <w:sz w:val="18"/>
@@ -1412,6 +1544,9 @@
             </w:tcMar>
           </w:tcPr>
           <w:p>
+            <w:pPr>
+              <w:keepNext/>
+            </w:pPr>
             <w:r>
               <w:rPr>
                 <w:sz w:val="18"/>
@@ -1438,6 +1573,9 @@
             </w:tcMar>
           </w:tcPr>
           <w:p>
+            <w:pPr>
+              <w:keepNext/>
+            </w:pPr>
             <w:r>
               <w:rPr>
                 <w:sz w:val="18"/>
@@ -1449,6 +1587,9 @@
         </w:tc>
       </w:tr>
       <w:tr>
+        <w:trPr>
+          <w:cantSplit/>
+        </w:trPr>
         <w:tc>
           <w:tcPr>
             <w:tcW w:type="dxa" w:w="3638"/>
@@ -1466,6 +1607,9 @@
             </w:tcMar>
           </w:tcPr>
           <w:p>
+            <w:pPr>
+              <w:keepNext w:val="false"/>
+            </w:pPr>
             <w:r>
               <w:rPr>
                 <w:sz w:val="18"/>
@@ -1492,6 +1636,9 @@
             </w:tcMar>
           </w:tcPr>
           <w:p>
+            <w:pPr>
+              <w:keepNext w:val="false"/>
+            </w:pPr>
             <w:r>
               <w:rPr>
                 <w:sz w:val="18"/>
@@ -1518,6 +1665,9 @@
             </w:tcMar>
           </w:tcPr>
           <w:p>
+            <w:pPr>
+              <w:keepNext w:val="false"/>
+            </w:pPr>
             <w:r>
               <w:rPr>
                 <w:sz w:val="18"/>
@@ -1544,6 +1694,9 @@
             </w:tcMar>
           </w:tcPr>
           <w:p>
+            <w:pPr>
+              <w:keepNext w:val="false"/>
+            </w:pPr>
             <w:r>
               <w:rPr>
                 <w:sz w:val="18"/>
@@ -1955,7 +2108,7 @@
       <w:r>
         <w:t xml:space="preserve"> at </w:t>
       </w:r>
-      <w:hyperlink w:history="1" r:id="rIdm4dzwmik0bpmojsqg_dlb">
+      <w:hyperlink w:history="1" r:id="rId_5zpwwmtj7k7oodbmf1l1">
         <w:r>
           <w:rPr>
             <w:rStyle w:val="Hyperlink"/>

</xml_diff>

<commit_message>
Report: explain the sample weighting, drop LightGBM 31 leaves
Co-Authored-By: Claude Opus 5.5 <noreply@anthropic.com>
</commit_message>
<xml_diff>
--- a/report/BT4012_Report.docx
+++ b/report/BT4012_Report.docx
@@ -41,7 +41,7 @@
         </w:rPr>
         <w:t xml:space="preserve">Code: </w:t>
       </w:r>
-      <w:hyperlink w:history="1" r:id="rIdn2d0gtok-zlasx__q2n2k">
+      <w:hyperlink w:history="1" r:id="rIdmncg-omyi22kpkicctxnc">
         <w:r>
           <w:rPr>
             <w:rStyle w:val="Hyperlink"/>
@@ -449,7 +449,77 @@
         <w:t xml:space="preserve">Imbalance and recency weighting.</w:t>
       </w:r>
       <w:r>
-        <w:t xml:space="preserve"> Illicit rows were weighted by the licit-to-illicit ratio (about 7.6). To counter drift, each row was also weighted by w = 0.5^((T − t)/h), so a row's weight halves every h steps back from the latest training step T. On the gap-matched split (Figure 2) a half-life of 10 clearly beat no weighting (0.881 vs. 0.854) and half-lives of 5, 20 and 40 (0.834–0.851). On the leaderboard it raised the score from 0.940 to 0.949, the largest single gain of the project.</w:t>
+        <w:t xml:space="preserve"> Instead of treating every training row equally, we gave each row its own weight in the loss, the product of two factors:</w:t>
+      </w:r>
+    </w:p>
+    <w:p>
+      <w:pPr>
+        <w:pStyle w:val="ListParagraph"/>
+        <w:numPr>
+          <w:ilvl w:val="0"/>
+          <w:numId w:val="2"/>
+        </w:numPr>
+        <w:spacing w:after="30" w:line="240"/>
+      </w:pPr>
+      <w:r>
+        <w:rPr>
+          <w:b/>
+          <w:bCs/>
+        </w:rPr>
+        <w:t xml:space="preserve">Class weight.</w:t>
+      </w:r>
+      <w:r>
+        <w:t xml:space="preserve"> Illicit rows get weight 7.6, the ratio of licit to illicit rows, and licit rows weight 1, so both classes contribute equally; otherwise the model can score well by mostly predicting licit. This is the standard "balanced" weighting.</w:t>
+      </w:r>
+    </w:p>
+    <w:p>
+      <w:pPr>
+        <w:pStyle w:val="ListParagraph"/>
+        <w:numPr>
+          <w:ilvl w:val="0"/>
+          <w:numId w:val="2"/>
+        </w:numPr>
+        <w:spacing w:after="30" w:line="240"/>
+      </w:pPr>
+      <w:r>
+        <w:rPr>
+          <w:b/>
+          <w:bCs/>
+        </w:rPr>
+        <w:t xml:space="preserve">Recency weight</w:t>
+      </w:r>
+      <w:r>
+        <w:t xml:space="preserve"> w = 0.5^((T − t)/h), where t is the row's time step, T the latest training step and h the half-life: the newest rows get weight 1, halving every h steps further back. We added it after diagnosing drift (Section 3): if fraud patterns change, recent labels are the best guide to the test period, but older rows still carry signal, so we down-weight rather than drop them. Exponential decay needs only one parameter, h.</w:t>
+      </w:r>
+    </w:p>
+    <w:p>
+      <w:pPr>
+        <w:spacing w:after="80" w:line="240"/>
+      </w:pPr>
+      <w:r>
+        <w:t xml:space="preserve">XGBoost's built-in class setting (</w:t>
+      </w:r>
+      <w:r>
+        <w:rPr>
+          <w:rFonts w:ascii="Consolas" w:cs="Consolas" w:eastAsia="Consolas" w:hAnsi="Consolas"/>
+          <w:sz w:val="20"/>
+          <w:szCs w:val="20"/>
+        </w:rPr>
+        <w:t xml:space="preserve">scale_pos_weight</w:t>
+      </w:r>
+      <w:r>
+        <w:t xml:space="preserve">) is a single global factor, so we multiplied the two factors into one weight per row and passed it as </w:t>
+      </w:r>
+      <w:r>
+        <w:rPr>
+          <w:rFonts w:ascii="Consolas" w:cs="Consolas" w:eastAsia="Consolas" w:hAnsi="Consolas"/>
+          <w:sz w:val="20"/>
+          <w:szCs w:val="20"/>
+        </w:rPr>
+        <w:t xml:space="preserve">sample_weight</w:t>
+      </w:r>
+      <w:r>
+        <w:t xml:space="preserve">. The half-life was chosen on the gap-matched split (Figure 2): 10 clearly beat no weighting (0.881 vs. 0.854) and half-lives of 5, 20 and 40 (0.834–0.851). The adjacent split could not make this choice: every half-life scored ≈ 0.998 on it, and its slight preference for 40 was rejected by the leaderboard. A half-life of 10 raised the leaderboard score from 0.940 to 0.949, the largest single gain of the project.</w:t>
       </w:r>
     </w:p>
     <w:p>
@@ -1131,7 +1201,7 @@
                 <w:sz w:val="18"/>
                 <w:szCs w:val="18"/>
               </w:rPr>
-              <w:t xml:space="preserve">LightGBM, 31 leaves (tuned)</w:t>
+              <w:t xml:space="preserve">MLP, one hidden layer</w:t>
             </w:r>
           </w:p>
         </w:tc>
@@ -1160,7 +1230,7 @@
                 <w:sz w:val="18"/>
                 <w:szCs w:val="18"/>
               </w:rPr>
-              <w:t xml:space="preserve">—</w:t>
+              <w:t xml:space="preserve">0.962 (worse)</w:t>
             </w:r>
           </w:p>
         </w:tc>
@@ -1189,7 +1259,7 @@
                 <w:sz w:val="18"/>
                 <w:szCs w:val="18"/>
               </w:rPr>
-              <w:t xml:space="preserve">0.896 (better)</w:t>
+              <w:t xml:space="preserve">0.899 (better)</w:t>
             </w:r>
           </w:p>
         </w:tc>
@@ -1218,7 +1288,7 @@
                 <w:sz w:val="18"/>
                 <w:szCs w:val="18"/>
               </w:rPr>
-              <w:t xml:space="preserve">0.93907 (worse)</w:t>
+              <w:t xml:space="preserve">0.91393 (worse)</w:t>
             </w:r>
           </w:p>
         </w:tc>
@@ -1252,7 +1322,7 @@
                 <w:sz w:val="18"/>
                 <w:szCs w:val="18"/>
               </w:rPr>
-              <w:t xml:space="preserve">MLP, one hidden layer</w:t>
+              <w:t xml:space="preserve">XGBoost + MLP rank blend (70/30)</w:t>
             </w:r>
           </w:p>
         </w:tc>
@@ -1281,7 +1351,7 @@
                 <w:sz w:val="18"/>
                 <w:szCs w:val="18"/>
               </w:rPr>
-              <w:t xml:space="preserve">0.962 (worse)</w:t>
+              <w:t xml:space="preserve">0.992 (worse)</w:t>
             </w:r>
           </w:p>
         </w:tc>
@@ -1310,7 +1380,7 @@
                 <w:sz w:val="18"/>
                 <w:szCs w:val="18"/>
               </w:rPr>
-              <w:t xml:space="preserve">0.899 (better)</w:t>
+              <w:t xml:space="preserve">0.888 (better)</w:t>
             </w:r>
           </w:p>
         </w:tc>
@@ -1339,7 +1409,7 @@
                 <w:sz w:val="18"/>
                 <w:szCs w:val="18"/>
               </w:rPr>
-              <w:t xml:space="preserve">0.91393 (worse)</w:t>
+              <w:t xml:space="preserve">0.95098 (worse)</w:t>
             </w:r>
           </w:p>
         </w:tc>
@@ -1373,7 +1443,7 @@
                 <w:sz w:val="18"/>
                 <w:szCs w:val="18"/>
               </w:rPr>
-              <w:t xml:space="preserve">XGBoost + MLP rank blend (70/30)</w:t>
+              <w:t xml:space="preserve">Random Forest + XGBoost blend (50/50)</w:t>
             </w:r>
           </w:p>
         </w:tc>
@@ -1402,7 +1472,7 @@
                 <w:sz w:val="18"/>
                 <w:szCs w:val="18"/>
               </w:rPr>
-              <w:t xml:space="preserve">0.992 (worse)</w:t>
+              <w:t xml:space="preserve">0.998 (better)</w:t>
             </w:r>
           </w:p>
         </w:tc>
@@ -1431,7 +1501,7 @@
                 <w:sz w:val="18"/>
                 <w:szCs w:val="18"/>
               </w:rPr>
-              <w:t xml:space="preserve">0.888 (better)</w:t>
+              <w:t xml:space="preserve">0.825 (worse)</w:t>
             </w:r>
           </w:p>
         </w:tc>
@@ -1460,7 +1530,7 @@
                 <w:sz w:val="18"/>
                 <w:szCs w:val="18"/>
               </w:rPr>
-              <w:t xml:space="preserve">0.95098 (worse)</w:t>
+              <w:t xml:space="preserve">Worse</w:t>
             </w:r>
           </w:p>
         </w:tc>
@@ -1487,127 +1557,6 @@
           </w:tcPr>
           <w:p>
             <w:pPr>
-              <w:keepNext/>
-            </w:pPr>
-            <w:r>
-              <w:rPr>
-                <w:sz w:val="18"/>
-                <w:szCs w:val="18"/>
-              </w:rPr>
-              <w:t xml:space="preserve">Random Forest + XGBoost blend (50/50)</w:t>
-            </w:r>
-          </w:p>
-        </w:tc>
-        <w:tc>
-          <w:tcPr>
-            <w:tcW w:type="dxa" w:w="1700"/>
-            <w:tcBorders>
-              <w:top w:val="single" w:color="C9C7BF" w:sz="4"/>
-              <w:left w:val="single" w:color="C9C7BF" w:sz="4"/>
-              <w:bottom w:val="single" w:color="C9C7BF" w:sz="4"/>
-              <w:right w:val="single" w:color="C9C7BF" w:sz="4"/>
-            </w:tcBorders>
-            <w:tcMar>
-              <w:top w:type="dxa" w:w="20"/>
-              <w:left w:type="dxa" w:w="80"/>
-              <w:bottom w:type="dxa" w:w="20"/>
-              <w:right w:type="dxa" w:w="80"/>
-            </w:tcMar>
-          </w:tcPr>
-          <w:p>
-            <w:pPr>
-              <w:keepNext/>
-            </w:pPr>
-            <w:r>
-              <w:rPr>
-                <w:sz w:val="18"/>
-                <w:szCs w:val="18"/>
-              </w:rPr>
-              <w:t xml:space="preserve">0.998 (better)</w:t>
-            </w:r>
-          </w:p>
-        </w:tc>
-        <w:tc>
-          <w:tcPr>
-            <w:tcW w:type="dxa" w:w="1700"/>
-            <w:tcBorders>
-              <w:top w:val="single" w:color="C9C7BF" w:sz="4"/>
-              <w:left w:val="single" w:color="C9C7BF" w:sz="4"/>
-              <w:bottom w:val="single" w:color="C9C7BF" w:sz="4"/>
-              <w:right w:val="single" w:color="C9C7BF" w:sz="4"/>
-            </w:tcBorders>
-            <w:tcMar>
-              <w:top w:type="dxa" w:w="20"/>
-              <w:left w:type="dxa" w:w="80"/>
-              <w:bottom w:type="dxa" w:w="20"/>
-              <w:right w:type="dxa" w:w="80"/>
-            </w:tcMar>
-          </w:tcPr>
-          <w:p>
-            <w:pPr>
-              <w:keepNext/>
-            </w:pPr>
-            <w:r>
-              <w:rPr>
-                <w:sz w:val="18"/>
-                <w:szCs w:val="18"/>
-              </w:rPr>
-              <w:t xml:space="preserve">0.825 (worse)</w:t>
-            </w:r>
-          </w:p>
-        </w:tc>
-        <w:tc>
-          <w:tcPr>
-            <w:tcW w:type="dxa" w:w="2600"/>
-            <w:tcBorders>
-              <w:top w:val="single" w:color="C9C7BF" w:sz="4"/>
-              <w:left w:val="single" w:color="C9C7BF" w:sz="4"/>
-              <w:bottom w:val="single" w:color="C9C7BF" w:sz="4"/>
-              <w:right w:val="single" w:color="C9C7BF" w:sz="4"/>
-            </w:tcBorders>
-            <w:tcMar>
-              <w:top w:type="dxa" w:w="20"/>
-              <w:left w:type="dxa" w:w="80"/>
-              <w:bottom w:type="dxa" w:w="20"/>
-              <w:right w:type="dxa" w:w="80"/>
-            </w:tcMar>
-          </w:tcPr>
-          <w:p>
-            <w:pPr>
-              <w:keepNext/>
-            </w:pPr>
-            <w:r>
-              <w:rPr>
-                <w:sz w:val="18"/>
-                <w:szCs w:val="18"/>
-              </w:rPr>
-              <w:t xml:space="preserve">Worse</w:t>
-            </w:r>
-          </w:p>
-        </w:tc>
-      </w:tr>
-      <w:tr>
-        <w:trPr>
-          <w:cantSplit/>
-        </w:trPr>
-        <w:tc>
-          <w:tcPr>
-            <w:tcW w:type="dxa" w:w="3638"/>
-            <w:tcBorders>
-              <w:top w:val="single" w:color="C9C7BF" w:sz="4"/>
-              <w:left w:val="single" w:color="C9C7BF" w:sz="4"/>
-              <w:bottom w:val="single" w:color="C9C7BF" w:sz="4"/>
-              <w:right w:val="single" w:color="C9C7BF" w:sz="4"/>
-            </w:tcBorders>
-            <w:tcMar>
-              <w:top w:type="dxa" w:w="20"/>
-              <w:left w:type="dxa" w:w="80"/>
-              <w:bottom w:type="dxa" w:w="20"/>
-              <w:right w:type="dxa" w:w="80"/>
-            </w:tcMar>
-          </w:tcPr>
-          <w:p>
-            <w:pPr>
               <w:keepNext w:val="false"/>
             </w:pPr>
             <w:r>
@@ -1719,7 +1668,7 @@
           <w:sz w:val="18"/>
           <w:szCs w:val="18"/>
         </w:rPr>
-        <w:t xml:space="preserve">Table 1. ROC-AUC of the main candidates; "better/worse" is relative to the XGBoost recipe on the same split. XGBoost validation uses all 85 features; other figures were recorded at the time of each experiment.</w:t>
+        <w:t xml:space="preserve">Table 1. ROC-AUC of the main candidates; "better/worse" is relative to the XGBoost recipe on the same split. XGBoost validation uses all 85 features; other figures were recorded at the time of each experiment. "—" = not measured: once the adjacent split saturated, tuning experiments were scored on the gap-matched split only, and Logistic Regression was never submitted.</w:t>
       </w:r>
     </w:p>
     <w:p>
@@ -1811,7 +1760,7 @@
       <w:r>
         <w:drawing>
           <wp:inline distT="0" distB="0" distL="0" distR="0">
-            <wp:extent cx="4286250" cy="2409825"/>
+            <wp:extent cx="4286250" cy="2209800"/>
             <wp:effectExtent t="0" r="0" b="0" l="0"/>
             <wp:docPr id="3" name="" descr="" title=""/>
             <wp:cNvGraphicFramePr>
@@ -1836,7 +1785,7 @@
                   <pic:spPr bwMode="auto">
                     <a:xfrm>
                       <a:off x="0" y="0"/>
-                      <a:ext cx="4286250" cy="2409825"/>
+                      <a:ext cx="4286250" cy="2209800"/>
                     </a:xfrm>
                     <a:prstGeom prst="rect">
                       <a:avLst/>
@@ -2108,7 +2057,7 @@
       <w:r>
         <w:t xml:space="preserve"> at </w:t>
       </w:r>
-      <w:hyperlink w:history="1" r:id="rId_5zpwwmtj7k7oodbmf1l1">
+      <w:hyperlink w:history="1" r:id="rIdfu_eyhe0-tq3wvlgam1bq">
         <w:r>
           <w:rPr>
             <w:rStyle w:val="Hyperlink"/>

</xml_diff>

<commit_message>
Report: define recency weight terms and how sample weights are used
Co-Authored-By: Claude Opus 5.5 <noreply@anthropic.com>
</commit_message>
<xml_diff>
--- a/report/BT4012_Report.docx
+++ b/report/BT4012_Report.docx
@@ -41,7 +41,7 @@
         </w:rPr>
         <w:t xml:space="preserve">Code: </w:t>
       </w:r>
-      <w:hyperlink w:history="1" r:id="rIdmncg-omyi22kpkicctxnc">
+      <w:hyperlink w:history="1" r:id="rIdslpypvuf-bqr8j9ey-b7n">
         <w:r>
           <w:rPr>
             <w:rStyle w:val="Hyperlink"/>
@@ -191,7 +191,7 @@
                     </pic:cNvPicPr>
                   </pic:nvPicPr>
                   <pic:blipFill>
-                    <a:blip r:embed="rId10" cstate="none"/>
+                    <a:blip r:embed="rId9" cstate="none"/>
                     <a:srcRect/>
                     <a:stretch>
                       <a:fillRect/>
@@ -449,7 +449,7 @@
         <w:t xml:space="preserve">Imbalance and recency weighting.</w:t>
       </w:r>
       <w:r>
-        <w:t xml:space="preserve"> Instead of treating every training row equally, we gave each row its own weight in the loss, the product of two factors:</w:t>
+        <w:t xml:space="preserve"> Instead of treating every training row equally, we gave each row its own weight, the product of two factors:</w:t>
       </w:r>
     </w:p>
     <w:p>
@@ -469,7 +469,7 @@
         <w:t xml:space="preserve">Class weight.</w:t>
       </w:r>
       <w:r>
-        <w:t xml:space="preserve"> Illicit rows get weight 7.6, the ratio of licit to illicit rows, and licit rows weight 1, so both classes contribute equally; otherwise the model can score well by mostly predicting licit. This is the standard "balanced" weighting.</w:t>
+        <w:t xml:space="preserve"> Illicit rows get weight 7.6, the ratio of licit to illicit rows, and licit rows weight 1, so both classes contribute equally; otherwise the model can score well by mostly predicting licit.</w:t>
       </w:r>
     </w:p>
     <w:p>
@@ -489,7 +489,7 @@
         <w:t xml:space="preserve">Recency weight</w:t>
       </w:r>
       <w:r>
-        <w:t xml:space="preserve"> w = 0.5^((T − t)/h), where t is the row's time step, T the latest training step and h the half-life: the newest rows get weight 1, halving every h steps further back. We added it after diagnosing drift (Section 3): if fraud patterns change, recent labels are the best guide to the test period, but older rows still carry signal, so we down-weight rather than drop them. Exponential decay needs only one parameter, h.</w:t>
+        <w:t xml:space="preserve"> w = 0.5^((T − t)/h), where t is the time step the transaction belongs to, T is the latest time step in the training data (35 for the final model; 30 or 20 on the validation splits) and h is the half-life. A row from step T gets weight 1, and the weight halves every h steps further back: with h = 10 and T = 35, a row from step 25 gets 0.5 and one from step 15 gets 0.25. We added this after diagnosing drift (Section 3): recent labels are the best guide to the test period, but older rows still carry signal, so we down-weight rather than drop them.</w:t>
       </w:r>
     </w:p>
     <w:p>
@@ -497,7 +497,14 @@
         <w:spacing w:after="80" w:line="240"/>
       </w:pPr>
       <w:r>
-        <w:t xml:space="preserve">XGBoost's built-in class setting (</w:t>
+        <w:rPr>
+          <w:b/>
+          <w:bCs/>
+        </w:rPr>
+        <w:t xml:space="preserve">How the weights are used.</w:t>
+      </w:r>
+      <w:r>
+        <w:t xml:space="preserve"> Each row's final weight is its class weight times its recency weight (an illicit row from step 35 counts 7.6; a licit row from step 15 counts 0.25). We pass these to the model as </w:t>
       </w:r>
       <w:r>
         <w:rPr>
@@ -505,21 +512,10 @@
           <w:sz w:val="20"/>
           <w:szCs w:val="20"/>
         </w:rPr>
-        <w:t xml:space="preserve">scale_pos_weight</w:t>
-      </w:r>
-      <w:r>
-        <w:t xml:space="preserve">) is a single global factor, so we multiplied the two factors into one weight per row and passed it as </w:t>
-      </w:r>
-      <w:r>
-        <w:rPr>
-          <w:rFonts w:ascii="Consolas" w:cs="Consolas" w:eastAsia="Consolas" w:hAnsi="Consolas"/>
-          <w:sz w:val="20"/>
-          <w:szCs w:val="20"/>
-        </w:rPr>
         <w:t xml:space="preserve">sample_weight</w:t>
       </w:r>
       <w:r>
-        <w:t xml:space="preserve">. The half-life was chosen on the gap-matched split (Figure 2): 10 clearly beat no weighting (0.881 vs. 0.854) and half-lives of 5, 20 and 40 (0.834–0.851). The adjacent split could not make this choice: every half-life scored ≈ 0.998 on it, and its slight preference for 40 was rejected by the leaderboard. A half-life of 10 raised the leaderboard score from 0.940 to 0.949, the largest single gain of the project.</w:t>
+        <w:t xml:space="preserve">: during training, each row's error in the loss is multiplied by its weight, so every new tree focuses on fixing mistakes on illicit and recent transactions. LightGBM and the MLP used the same weights. The half-life was chosen on the gap-matched split (Figure 2): 10 clearly beat no weighting (0.881 vs. 0.854) and half-lives of 5, 20 and 40 (0.834–0.851). The adjacent split could not make this choice: every half-life scored ≈ 0.998 on it. A half-life of 10 raised the leaderboard score from 0.940 to 0.949, the largest single gain of the project.</w:t>
       </w:r>
     </w:p>
     <w:p>
@@ -547,7 +543,7 @@
                     </pic:cNvPicPr>
                   </pic:nvPicPr>
                   <pic:blipFill>
-                    <a:blip r:embed="rId11" cstate="none"/>
+                    <a:blip r:embed="rId10" cstate="none"/>
                     <a:srcRect/>
                     <a:stretch>
                       <a:fillRect/>
@@ -1760,9 +1756,152 @@
       <w:r>
         <w:drawing>
           <wp:inline distT="0" distB="0" distL="0" distR="0">
-            <wp:extent cx="4286250" cy="2209800"/>
+            <wp:extent cx="4000500" cy="2066925"/>
             <wp:effectExtent t="0" r="0" b="0" l="0"/>
             <wp:docPr id="3" name="" descr="" title=""/>
+            <wp:cNvGraphicFramePr>
+              <a:graphicFrameLocks xmlns:a="http://schemas.openxmlformats.org/drawingml/2006/main" noChangeAspect="1"/>
+            </wp:cNvGraphicFramePr>
+            <a:graphic xmlns:a="http://schemas.openxmlformats.org/drawingml/2006/main">
+              <a:graphicData uri="http://schemas.openxmlformats.org/drawingml/2006/picture">
+                <pic:pic xmlns:pic="http://schemas.openxmlformats.org/drawingml/2006/picture">
+                  <pic:nvPicPr>
+                    <pic:cNvPr id="0" name="" descr=""/>
+                    <pic:cNvPicPr>
+                      <a:picLocks noChangeAspect="1" noChangeArrowheads="1"/>
+                    </pic:cNvPicPr>
+                  </pic:nvPicPr>
+                  <pic:blipFill>
+                    <a:blip r:embed="rId11" cstate="none"/>
+                    <a:srcRect/>
+                    <a:stretch>
+                      <a:fillRect/>
+                    </a:stretch>
+                  </pic:blipFill>
+                  <pic:spPr bwMode="auto">
+                    <a:xfrm>
+                      <a:off x="0" y="0"/>
+                      <a:ext cx="4000500" cy="2066925"/>
+                    </a:xfrm>
+                    <a:prstGeom prst="rect">
+                      <a:avLst/>
+                    </a:prstGeom>
+                  </pic:spPr>
+                </pic:pic>
+              </a:graphicData>
+            </a:graphic>
+          </wp:inline>
+        </w:drawing>
+      </w:r>
+    </w:p>
+    <w:p>
+      <w:pPr>
+        <w:spacing w:after="100" w:before="40"/>
+        <w:jc w:val="left"/>
+      </w:pPr>
+      <w:r>
+        <w:rPr>
+          <w:color w:val="52514E"/>
+          <w:sz w:val="18"/>
+          <w:szCs w:val="18"/>
+        </w:rPr>
+        <w:t xml:space="preserve">Figure 3. Public leaderboard ROC-AUC of our scored submissions.</w:t>
+      </w:r>
+    </w:p>
+    <w:p>
+      <w:pPr>
+        <w:spacing w:after="80" w:line="240"/>
+      </w:pPr>
+      <w:r>
+        <w:rPr>
+          <w:b/>
+          <w:bCs/>
+        </w:rPr>
+        <w:t xml:space="preserve">Drift explains the gap between validation and leaderboard.</w:t>
+      </w:r>
+      <w:r>
+        <w:t xml:space="preserve"> Models scoring ≈ 0.998 on the adjacent split scored 0.94–0.95 on the leaderboard. A classifier trained to tell early from late time steps using only the features reached ROC-AUC 1.0, and both tree and linear models lost accuracy as the validation window moved further from training (e.g. Logistic Regression 0.875 → 0.818). The test period also spans the shutdown of a major dark market (around step 43 in the original Elliptic study), a shift no training data covers. This is why recency weighting helped most.</w:t>
+      </w:r>
+    </w:p>
+    <w:p>
+      <w:pPr>
+        <w:spacing w:after="80" w:line="240"/>
+      </w:pPr>
+      <w:r>
+        <w:rPr>
+          <w:b/>
+          <w:bCs/>
+        </w:rPr>
+        <w:t xml:space="preserve">Neither validation split was reliable on its own</w:t>
+      </w:r>
+      <w:r>
+        <w:t xml:space="preserve"> (Table 1). The gap-matched split was right about training choices (recency weighting, the half-life) and about the Random Forest blend, which the adjacent split favoured, but it favoured every more flexible model, and all of them lost on the leaderboard. With one window of about 4,900 rows, differences of 0.01–0.02 are within noise, and a 72-configuration grid will find a model that fits that window's quirks. The adjacent split is near its ceiling, yet it correctly predicted the MLP's loss (−0.035 on validation, −0.041 on the leaderboard). We therefore used the gap-matched split for training choices, the adjacent split as a check on model families, and the leaderboard as the final arbiter. Across all experiments, more regularised models held up better.</w:t>
+      </w:r>
+    </w:p>
+    <w:p>
+      <w:pPr>
+        <w:spacing w:after="80" w:line="240"/>
+      </w:pPr>
+      <w:r>
+        <w:rPr>
+          <w:b/>
+          <w:bCs/>
+        </w:rPr>
+        <w:t xml:space="preserve">What drives the model.</w:t>
+      </w:r>
+      <w:r>
+        <w:t xml:space="preserve"> By SHAP (Figure 4), two anonymised features dominate (</w:t>
+      </w:r>
+      <w:r>
+        <w:rPr>
+          <w:rFonts w:ascii="Consolas" w:cs="Consolas" w:eastAsia="Consolas" w:hAnsi="Consolas"/>
+          <w:sz w:val="20"/>
+          <w:szCs w:val="20"/>
+        </w:rPr>
+        <w:t xml:space="preserve">feat_53</w:t>
+      </w:r>
+      <w:r>
+        <w:t xml:space="preserve"> and </w:t>
+      </w:r>
+      <w:r>
+        <w:rPr>
+          <w:rFonts w:ascii="Consolas" w:cs="Consolas" w:eastAsia="Consolas" w:hAnsi="Consolas"/>
+          <w:sz w:val="20"/>
+          <w:szCs w:val="20"/>
+        </w:rPr>
+        <w:t xml:space="preserve">feat_59</w:t>
+      </w:r>
+      <w:r>
+        <w:t xml:space="preserve">, about 12% and 11% of total impact). Six of the 11 graph features made the final 45, together about 5% of total impact, yet adding them raised the leaderboard score. PageRank barely depends on the time step, but community size is partly a proxy for the period (45% of its variance), a hidden-clock risk under drift.</w:t>
+      </w:r>
+    </w:p>
+    <w:p>
+      <w:pPr>
+        <w:spacing w:after="80" w:line="240"/>
+      </w:pPr>
+      <w:r>
+        <w:rPr>
+          <w:b/>
+          <w:bCs/>
+        </w:rPr>
+        <w:t xml:space="preserve">Better communities did not mean better features.</w:t>
+      </w:r>
+      <w:r>
+        <w:t xml:space="preserve"> Louvain is known to merge small groups into very large communities (the resolution limit of modularity); here the typical transaction sat in a community of about 3,200. Running the Leiden algorithm separately within each time step fixed this (typical size 89) and made community size far less time-dependent (21%), but validation was essentially unchanged and the leaderboard score did not improve, so we kept Louvain. Removing the most time-revealing features also lowered the score: drifting features can still carry signal.</w:t>
+      </w:r>
+    </w:p>
+    <w:p>
+      <w:pPr>
+        <w:keepNext/>
+        <w:spacing w:after="0" w:before="60"/>
+        <w:jc w:val="center"/>
+      </w:pPr>
+      <w:r>
+        <w:drawing>
+          <wp:inline distT="0" distB="0" distL="0" distR="0">
+            <wp:extent cx="3238500" cy="2276475"/>
+            <wp:effectExtent t="0" r="0" b="0" l="0"/>
+            <wp:docPr id="4" name="" descr="" title=""/>
             <wp:cNvGraphicFramePr>
               <a:graphicFrameLocks xmlns:a="http://schemas.openxmlformats.org/drawingml/2006/main" noChangeAspect="1"/>
             </wp:cNvGraphicFramePr>
@@ -1785,149 +1924,6 @@
                   <pic:spPr bwMode="auto">
                     <a:xfrm>
                       <a:off x="0" y="0"/>
-                      <a:ext cx="4286250" cy="2209800"/>
-                    </a:xfrm>
-                    <a:prstGeom prst="rect">
-                      <a:avLst/>
-                    </a:prstGeom>
-                  </pic:spPr>
-                </pic:pic>
-              </a:graphicData>
-            </a:graphic>
-          </wp:inline>
-        </w:drawing>
-      </w:r>
-    </w:p>
-    <w:p>
-      <w:pPr>
-        <w:spacing w:after="100" w:before="40"/>
-        <w:jc w:val="left"/>
-      </w:pPr>
-      <w:r>
-        <w:rPr>
-          <w:color w:val="52514E"/>
-          <w:sz w:val="18"/>
-          <w:szCs w:val="18"/>
-        </w:rPr>
-        <w:t xml:space="preserve">Figure 3. Public leaderboard ROC-AUC of our scored submissions.</w:t>
-      </w:r>
-    </w:p>
-    <w:p>
-      <w:pPr>
-        <w:spacing w:after="80" w:line="240"/>
-      </w:pPr>
-      <w:r>
-        <w:rPr>
-          <w:b/>
-          <w:bCs/>
-        </w:rPr>
-        <w:t xml:space="preserve">Drift explains the gap between validation and leaderboard.</w:t>
-      </w:r>
-      <w:r>
-        <w:t xml:space="preserve"> Models scoring ≈ 0.998 on the adjacent split scored 0.94–0.95 on the leaderboard. A classifier trained to tell early from late time steps using only the features reached ROC-AUC 1.0, and both tree and linear models lost accuracy as the validation window moved further from training (e.g. Logistic Regression 0.875 → 0.818). The test period also spans the shutdown of a major dark market (around step 43 in the original Elliptic study), a shift no training data covers. Recency weighting, which lets the model rely more on recent behaviour, was therefore the most valuable change.</w:t>
-      </w:r>
-    </w:p>
-    <w:p>
-      <w:pPr>
-        <w:spacing w:after="80" w:line="240"/>
-      </w:pPr>
-      <w:r>
-        <w:rPr>
-          <w:b/>
-          <w:bCs/>
-        </w:rPr>
-        <w:t xml:space="preserve">Neither validation split was reliable on its own</w:t>
-      </w:r>
-      <w:r>
-        <w:t xml:space="preserve"> (Table 1). The gap-matched split was right about training choices (recency weighting, the half-life) and about the Random Forest blend, which the adjacent split favoured, but it favoured every more flexible model, and all of them lost on the leaderboard. With one window of about 4,900 rows, differences of 0.01–0.02 are within noise, and a 72-configuration grid will find a model that fits that window's quirks. The adjacent split is near its ceiling, yet it correctly predicted the MLP's loss (−0.035 on validation, −0.041 on the leaderboard). We therefore used the gap-matched split for training choices, the adjacent split as a check on model families, and the leaderboard as the final arbiter. Across all experiments, more regularised models held up better.</w:t>
-      </w:r>
-    </w:p>
-    <w:p>
-      <w:pPr>
-        <w:spacing w:after="80" w:line="240"/>
-      </w:pPr>
-      <w:r>
-        <w:rPr>
-          <w:b/>
-          <w:bCs/>
-        </w:rPr>
-        <w:t xml:space="preserve">What drives the model.</w:t>
-      </w:r>
-      <w:r>
-        <w:t xml:space="preserve"> By SHAP (Figure 4), two anonymised features dominate (</w:t>
-      </w:r>
-      <w:r>
-        <w:rPr>
-          <w:rFonts w:ascii="Consolas" w:cs="Consolas" w:eastAsia="Consolas" w:hAnsi="Consolas"/>
-          <w:sz w:val="20"/>
-          <w:szCs w:val="20"/>
-        </w:rPr>
-        <w:t xml:space="preserve">feat_53</w:t>
-      </w:r>
-      <w:r>
-        <w:t xml:space="preserve"> and </w:t>
-      </w:r>
-      <w:r>
-        <w:rPr>
-          <w:rFonts w:ascii="Consolas" w:cs="Consolas" w:eastAsia="Consolas" w:hAnsi="Consolas"/>
-          <w:sz w:val="20"/>
-          <w:szCs w:val="20"/>
-        </w:rPr>
-        <w:t xml:space="preserve">feat_59</w:t>
-      </w:r>
-      <w:r>
-        <w:t xml:space="preserve">, about 12% and 11% of total impact). Six of the 11 graph features made the final 45, together about 5% of total impact, yet adding them raised the leaderboard score. PageRank barely depends on the time step, but community size is partly a proxy for the period (45% of its variance), a hidden-clock risk under drift.</w:t>
-      </w:r>
-    </w:p>
-    <w:p>
-      <w:pPr>
-        <w:spacing w:after="80" w:line="240"/>
-      </w:pPr>
-      <w:r>
-        <w:rPr>
-          <w:b/>
-          <w:bCs/>
-        </w:rPr>
-        <w:t xml:space="preserve">Better communities did not mean better features.</w:t>
-      </w:r>
-      <w:r>
-        <w:t xml:space="preserve"> Louvain is known to merge small groups into very large communities (the resolution limit of modularity); here the typical transaction sat in a community of about 3,200. Running the Leiden algorithm separately within each time step fixed this (typical size 89) and made community size far less time-dependent (21%), but validation was essentially unchanged and the leaderboard score did not improve, so we kept Louvain. Removing the most time-revealing features also lowered the score: drifting features can still carry signal.</w:t>
-      </w:r>
-    </w:p>
-    <w:p>
-      <w:pPr>
-        <w:keepNext/>
-        <w:spacing w:after="0" w:before="60"/>
-        <w:jc w:val="center"/>
-      </w:pPr>
-      <w:r>
-        <w:drawing>
-          <wp:inline distT="0" distB="0" distL="0" distR="0">
-            <wp:extent cx="3238500" cy="2276475"/>
-            <wp:effectExtent t="0" r="0" b="0" l="0"/>
-            <wp:docPr id="4" name="" descr="" title=""/>
-            <wp:cNvGraphicFramePr>
-              <a:graphicFrameLocks xmlns:a="http://schemas.openxmlformats.org/drawingml/2006/main" noChangeAspect="1"/>
-            </wp:cNvGraphicFramePr>
-            <a:graphic xmlns:a="http://schemas.openxmlformats.org/drawingml/2006/main">
-              <a:graphicData uri="http://schemas.openxmlformats.org/drawingml/2006/picture">
-                <pic:pic xmlns:pic="http://schemas.openxmlformats.org/drawingml/2006/picture">
-                  <pic:nvPicPr>
-                    <pic:cNvPr id="0" name="" descr=""/>
-                    <pic:cNvPicPr>
-                      <a:picLocks noChangeAspect="1" noChangeArrowheads="1"/>
-                    </pic:cNvPicPr>
-                  </pic:nvPicPr>
-                  <pic:blipFill>
-                    <a:blip r:embed="rId13" cstate="none"/>
-                    <a:srcRect/>
-                    <a:stretch>
-                      <a:fillRect/>
-                    </a:stretch>
-                  </pic:blipFill>
-                  <pic:spPr bwMode="auto">
-                    <a:xfrm>
-                      <a:off x="0" y="0"/>
                       <a:ext cx="3238500" cy="2276475"/>
                     </a:xfrm>
                     <a:prstGeom prst="rect">
@@ -1967,7 +1963,7 @@
         <w:t xml:space="preserve">Limitations.</w:t>
       </w:r>
       <w:r>
-        <w:t xml:space="preserve"> Each validation split is a single window; more than a dozen leaderboard submissions risk overfitting its public portion, and the final choice (0.95483 vs. 0.95430) rests on a difference of that size. The features are anonymised, which limits domain interpretation, and betweenness was estimated by sampling.</w:t>
+        <w:t xml:space="preserve"> Each validation split is a single window; more than a dozen leaderboard submissions risk overfitting its public portion, and the final choice (0.95483 vs. 0.95430) rests on a difference of that size. The features are anonymised, which limits domain interpretation.</w:t>
       </w:r>
     </w:p>
     <w:p>
@@ -2030,7 +2026,7 @@
           <w:i/>
           <w:iCs/>
         </w:rPr>
-        <w:t xml:space="preserve">Code and reproducibility:</w:t>
+        <w:t xml:space="preserve">Code:</w:t>
       </w:r>
       <w:r>
         <w:t xml:space="preserve"> notebooks </w:t>
@@ -2055,20 +2051,7 @@
         <w:t xml:space="preserve">05</w:t>
       </w:r>
       <w:r>
-        <w:t xml:space="preserve"> at </w:t>
-      </w:r>
-      <w:hyperlink w:history="1" r:id="rIdfu_eyhe0-tq3wvlgam1bq">
-        <w:r>
-          <w:rPr>
-            <w:rStyle w:val="Hyperlink"/>
-            <w:color w:val="1F5FBF"/>
-            <w:u w:val="single"/>
-          </w:rPr>
-          <w:t xml:space="preserve">https://github.com/timc5nn/BT4012</w:t>
-        </w:r>
-      </w:hyperlink>
-      <w:r>
-        <w:t xml:space="preserve">; running </w:t>
+        <w:t xml:space="preserve"> on GitHub (link above); running </w:t>
       </w:r>
       <w:r>
         <w:rPr>
@@ -2076,7 +2059,7 @@
           <w:sz w:val="20"/>
           <w:szCs w:val="20"/>
         </w:rPr>
-        <w:t xml:space="preserve">02_preprocessing</w:t>
+        <w:t xml:space="preserve">02</w:t>
       </w:r>
       <w:r>
         <w:t xml:space="preserve"> then </w:t>
@@ -2087,21 +2070,10 @@
           <w:sz w:val="20"/>
           <w:szCs w:val="20"/>
         </w:rPr>
-        <w:t xml:space="preserve">03_supervised_learning</w:t>
-      </w:r>
-      <w:r>
-        <w:t xml:space="preserve"> reproduces the final submission exactly (package versions in </w:t>
-      </w:r>
-      <w:r>
-        <w:rPr>
-          <w:rFonts w:ascii="Consolas" w:cs="Consolas" w:eastAsia="Consolas" w:hAnsi="Consolas"/>
-          <w:sz w:val="20"/>
-          <w:szCs w:val="20"/>
-        </w:rPr>
-        <w:t xml:space="preserve">requirements.txt</w:t>
-      </w:r>
-      <w:r>
-        <w:t xml:space="preserve">).</w:t>
+        <w:t xml:space="preserve">03</w:t>
+      </w:r>
+      <w:r>
+        <w:t xml:space="preserve"> reproduces the final submission exactly.</w:t>
       </w:r>
     </w:p>
     <w:sectPr>

</xml_diff>

<commit_message>
Report: keep only claims backed by the notebooks
Remove PCA/UMAP, Leiden and other figures not computed in the current notebooks;
05 outcome note now states only what the notebook shows.

Co-Authored-By: Claude Opus 5.5 <noreply@anthropic.com>
</commit_message>
<xml_diff>
--- a/report/BT4012_Report.docx
+++ b/report/BT4012_Report.docx
@@ -41,7 +41,7 @@
         </w:rPr>
         <w:t xml:space="preserve">Code: </w:t>
       </w:r>
-      <w:hyperlink w:history="1" r:id="rId-cvolbwyvqa-qsh7uo-fk">
+      <w:hyperlink w:history="1" r:id="rIddkukpvre_mq5c7-7xycre">
         <w:r>
           <w:rPr>
             <w:rStyle w:val="Hyperlink"/>
@@ -210,7 +210,7 @@
         <w:t xml:space="preserve">Centrality:</w:t>
       </w:r>
       <w:r>
-        <w:t xml:space="preserve"> betweenness (estimated from 5,000 sampled sources), closeness and PageRank. PageRank replaced eigenvector centrality, which is non-zero for only 2.2% of transactions on a disconnected graph.</w:t>
+        <w:t xml:space="preserve"> betweenness (estimated from 5,000 sampled sources), closeness and PageRank. PageRank replaced eigenvector centrality, which puts almost all its weight on the largest component and gives ≈ 0 to every other time step.</w:t>
       </w:r>
     </w:p>
     <w:p>
@@ -290,7 +290,7 @@
         <w:t xml:space="preserve">Unlabelled rows.</w:t>
       </w:r>
       <w:r>
-        <w:t xml:space="preserve"> Label propagation (k-nearest-neighbour, threshold 0.9) assigned confident pseudo-labels to 48,014 unlabelled transactions. Adding them to training lowered validation ROC-AUC (0.997 → 0.964 at confidence ≥ 0.95, 0.986 at ≥ 0.99) and the leaderboard score, so the final model uses genuine labels only. PCA, UMAP and clustering also showed no separate illicit cluster, favouring supervised models.</w:t>
+        <w:t xml:space="preserve"> Label propagation (k-nearest-neighbour, threshold 0.9) assigned confident pseudo-labels to 48,014 unlabelled transactions. Adding them to training lowered validation ROC-AUC (0.997 → 0.964 at confidence ≥ 0.95, 0.986 at ≥ 0.99) and the leaderboard score, so the final model uses genuine labels only.</w:t>
       </w:r>
     </w:p>
     <w:p>
@@ -638,7 +638,7 @@
         <w:t xml:space="preserve">ranks</w:t>
       </w:r>
       <w:r>
-        <w:t xml:space="preserve"> of two models' predictions (ROC-AUC only scores the ordering). A blend only helps if the models make different mistakes: LightGBM ranked transactions almost like XGBoost (correlation 0.94), so blending gained nothing; the MLP was very different (0.68) but too weak, and Random Forest degraded too fast on later periods, so both blends scored below XGBoost alone.</w:t>
+        <w:t xml:space="preserve"> of two models' predictions (ROC-AUC only scores the ordering). A blend only helps if the models make different mistakes: LightGBM ranked transactions almost like XGBoost (correlation 0.94), so blending gained nothing. The MLP was very different (0.68) but too weak. The Random Forest blend scored slightly higher on the adjacent split (0.998 vs. 0.997) but lower on the leaderboard.</w:t>
       </w:r>
     </w:p>
     <w:tbl>
@@ -1489,7 +1489,7 @@
                 <w:sz w:val="18"/>
                 <w:szCs w:val="18"/>
               </w:rPr>
-              <w:t xml:space="preserve">0.825 (worse)</w:t>
+              <w:t xml:space="preserve">—</w:t>
             </w:r>
           </w:p>
         </w:tc>
@@ -1656,7 +1656,7 @@
           <w:sz w:val="18"/>
           <w:szCs w:val="18"/>
         </w:rPr>
-        <w:t xml:space="preserve">Table 1. ROC-AUC of the main candidates; "better/worse" is relative to the XGBoost recipe on the same split. XGBoost validation uses all 85 features; other figures were recorded at the time of each experiment. "—" = not measured: once the adjacent split saturated, tuning experiments were scored on the gap-matched split only, and Logistic Regression was never submitted.</w:t>
+        <w:t xml:space="preserve">Table 1. ROC-AUC of the main candidates; "better/worse" is relative to the XGBoost recipe on the same split. XGBoost validation uses all 85 features; other figures were recorded at the time of each experiment. "—" = not measured.</w:t>
       </w:r>
     </w:p>
     <w:p>
@@ -1767,7 +1767,7 @@
         <w:t xml:space="preserve">Drift explains the gap between validation and leaderboard.</w:t>
       </w:r>
       <w:r>
-        <w:t xml:space="preserve"> Models scoring ≈ 0.998 on the adjacent split scored 0.94–0.95 on the leaderboard. A classifier trained to tell early from late time steps using only the features reached ROC-AUC 1.0, and both tree and linear models lost accuracy as the validation window moved further from training (e.g. Logistic Regression 0.875 → 0.818). The test period also spans the shutdown of a major dark market (around step 43 in the original Elliptic study), a shift no training data covers. This is why recency weighting helped most.</w:t>
+        <w:t xml:space="preserve"> Models scoring ≈ 0.998 on the adjacent split scored 0.94–0.95 on the leaderboard. A classifier trained to tell early from late time steps using only the features reached ROC-AUC 1.0, so the features themselves change over time. The test period also spans the shutdown of a major dark market (around step 43 in the original Elliptic study), a shift no training data covers. This is why recency weighting helped most.</w:t>
       </w:r>
     </w:p>
     <w:p>
@@ -1782,7 +1782,7 @@
         <w:t xml:space="preserve">Neither validation split was reliable on its own</w:t>
       </w:r>
       <w:r>
-        <w:t xml:space="preserve"> (Table 1). The gap-matched split was right about training choices (recency weighting, the half-life) and about the Random Forest blend, which the adjacent split favoured, but it favoured every more flexible model, and all of them lost on the leaderboard. With one window of about 4,900 rows, differences of 0.01–0.02 are within noise, and a 72-configuration grid will find a model that fits that window's quirks. The adjacent split is near its ceiling, yet it correctly predicted the MLP's loss (−0.035 on validation, −0.041 on the leaderboard). We therefore used the gap-matched split for training choices, the adjacent split as a check on model families, and the leaderboard as the final arbiter. Across all experiments, more regularised models held up better.</w:t>
+        <w:t xml:space="preserve"> (Table 1). The gap-matched split was right about training choices (recency weighting, the half-life), but it favoured every more flexible model, and all of them lost on the leaderboard. The adjacent split also misled once, favouring the Random Forest blend. With one window of about 4,900 rows, differences of 0.01–0.02 are within noise, and a 72-configuration grid will find a model that fits that window's quirks. The adjacent split is near its ceiling, yet it correctly predicted the MLP's loss (−0.035 on validation, −0.041 on the leaderboard). We therefore used the gap-matched split for training choices, the adjacent split as a check on model families, and the leaderboard as the final arbiter. Across all experiments, more regularised models held up better.</w:t>
       </w:r>
     </w:p>
     <w:p>
@@ -1819,22 +1819,7 @@
         <w:t xml:space="preserve">feat_59</w:t>
       </w:r>
       <w:r>
-        <w:t xml:space="preserve">, about 12% and 11% of total impact). Six of the 11 graph features made the final 45, together about 5% of total impact, yet adding them raised the leaderboard score. PageRank barely depends on the time step, but community size is partly a proxy for the period (45% of its variance), a hidden-clock risk under drift.</w:t>
-      </w:r>
-    </w:p>
-    <w:p>
-      <w:pPr>
-        <w:spacing w:after="80" w:line="240"/>
-      </w:pPr>
-      <w:r>
-        <w:rPr>
-          <w:b/>
-          <w:bCs/>
-        </w:rPr>
-        <w:t xml:space="preserve">Better communities did not mean better features.</w:t>
-      </w:r>
-      <w:r>
-        <w:t xml:space="preserve"> Louvain is known to merge small groups into very large communities (the resolution limit of modularity); here the typical transaction sat in a community of about 3,200. Running the Leiden algorithm separately within each time step fixed this (typical size 89) and made community size far less time-dependent (21%), but validation was essentially unchanged and the leaderboard score did not improve, so we kept Louvain. Removing the most time-revealing features also lowered the score: drifting features can still carry signal.</w:t>
+        <w:t xml:space="preserve">, about 12% and 11% of total impact). No graph feature reaches the top 15, yet adding the graph features raised the leaderboard score: they add a small amount of information the anonymised features lack. Removing the most time-revealing features found by adversarial validation lowered the score, so drifting features can still carry signal.</w:t>
       </w:r>
     </w:p>
     <w:p>
@@ -1928,7 +1913,7 @@
         <w:spacing w:after="80" w:line="240"/>
       </w:pPr>
       <w:r>
-        <w:t xml:space="preserve">We built a recency-weighted XGBoost model with redundancy- and VIF-based feature selection, label-free graph features and SHAP-based reduction, reaching a public leaderboard ROC-AUC of 0.95483. Recency weighting produced the largest gain and graph features the second, while more flexible models (LightGBM, a neural network), heavier tuning, ensembles, pseudo-labels and cleaner communities did not beat a regularised XGBoost.</w:t>
+        <w:t xml:space="preserve">We built a recency-weighted XGBoost model with redundancy- and VIF-based feature selection, label-free graph features and SHAP-based reduction, reaching a public leaderboard ROC-AUC of 0.95483. Recency weighting produced the largest gain and graph features the second, while more flexible models (LightGBM, a neural network), heavier tuning, ensembles and pseudo-labels did not beat a regularised XGBoost.</w:t>
       </w:r>
     </w:p>
     <w:p>

</xml_diff>

<commit_message>
Report: explain the pseudo-label attempt for unlabelled rows
Co-Authored-By: Claude Opus 5.5 <noreply@anthropic.com>
</commit_message>
<xml_diff>
--- a/report/BT4012_Report.docx
+++ b/report/BT4012_Report.docx
@@ -41,7 +41,7 @@
         </w:rPr>
         <w:t xml:space="preserve">Code: </w:t>
       </w:r>
-      <w:hyperlink w:history="1" r:id="rIddkukpvre_mq5c7-7xycre">
+      <w:hyperlink w:history="1" r:id="rIdnrjtebjijgqijiqmt-4fv">
         <w:r>
           <w:rPr>
             <w:rStyle w:val="Hyperlink"/>
@@ -290,7 +290,7 @@
         <w:t xml:space="preserve">Unlabelled rows.</w:t>
       </w:r>
       <w:r>
-        <w:t xml:space="preserve"> Label propagation (k-nearest-neighbour, threshold 0.9) assigned confident pseudo-labels to 48,014 unlabelled transactions. Adding them to training lowered validation ROC-AUC (0.997 → 0.964 at confidence ≥ 0.95, 0.986 at ≥ 0.99) and the leaderboard score, so the final model uses genuine labels only.</w:t>
+        <w:t xml:space="preserve"> 78% of training transactions have no label, so we tried to turn some of them into extra training examples, hoping more data (especially more illicit examples) would help the model predict more accurately. Label propagation (k-nearest-neighbour, 7 neighbours) spreads the known labels to unlabelled transactions with similar features; we kept only confident predictions (≥ 0.9), giving pseudo-labels for 48,014 transactions. The results said otherwise: adding them lowered validation ROC-AUC from 0.997 to 0.964 (confidence ≥ 0.95) and 0.986 (≥ 0.99), and both versions scored lower on the leaderboard, likely because even confident pseudo-labels contain errors. We therefore trained only on the original 31,235 labels.</w:t>
       </w:r>
     </w:p>
     <w:p>

</xml_diff>

<commit_message>
Report: place half-life chart before the weighting paragraph
Co-Authored-By: Claude Opus 5.5 <noreply@anthropic.com>
</commit_message>
<xml_diff>
--- a/report/BT4012_Report.docx
+++ b/report/BT4012_Report.docx
@@ -41,7 +41,7 @@
         </w:rPr>
         <w:t xml:space="preserve">Code: </w:t>
       </w:r>
-      <w:hyperlink w:history="1" r:id="rIdndzcdberxsansmi9g-rmy">
+      <w:hyperlink w:history="1" r:id="rIdsdvdklqgpedtzgjlhp2dl">
         <w:r>
           <w:rPr>
             <w:rStyle w:val="Hyperlink"/>
@@ -436,25 +436,6 @@
       </w:r>
       <w:r>
         <w:t xml:space="preserve"> w = 0.5^((T − t)/h), where t is the time step the transaction belongs to, T is the latest time step in the training data (35 for the final model; 30 or 20 on the validation splits) and h is the half-life. A row from step T gets weight 1, and the weight halves every h steps further back: with h = 10 and T = 35, a row from step 25 gets 0.5 and one from step 15 gets 0.25. Because fraud patterns drift, recent labels are the best guide to the test period, but older rows still carry signal, so we down-weight rather than drop them.</w:t>
-      </w:r>
-    </w:p>
-    <w:p>
-      <w:pPr>
-        <w:spacing w:after="80" w:line="240"/>
-      </w:pPr>
-      <w:r>
-        <w:t xml:space="preserve">Each row's final weight is the product (an illicit row from step 35 counts 7.6; a licit row from step 15 counts 0.25). It is passed to the model as </w:t>
-      </w:r>
-      <w:r>
-        <w:rPr>
-          <w:rFonts w:ascii="Consolas" w:cs="Consolas" w:eastAsia="Consolas" w:hAnsi="Consolas"/>
-          <w:sz w:val="20"/>
-          <w:szCs w:val="20"/>
-        </w:rPr>
-        <w:t xml:space="preserve">sample_weight</w:t>
-      </w:r>
-      <w:r>
-        <w:t xml:space="preserve">, which multiplies that row's error in the training loss, so the model concentrates on getting illicit and recent transactions right. LightGBM and the MLP used the same weights. A half-life of 10 clearly beat no weighting (0.881 vs. 0.854) and half-lives of 5, 20 and 40 (Figure 1), and raised the leaderboard score from 0.940 to 0.949, the largest single gain of the project.</w:t>
       </w:r>
     </w:p>
     <w:p>
@@ -516,6 +497,25 @@
           <w:szCs w:val="18"/>
         </w:rPr>
         <w:t xml:space="preserve">Figure 1. Gap-matched validation ROC-AUC of XGBoost by recency half-life.</w:t>
+      </w:r>
+    </w:p>
+    <w:p>
+      <w:pPr>
+        <w:spacing w:after="80" w:line="240"/>
+      </w:pPr>
+      <w:r>
+        <w:t xml:space="preserve">Each row's final weight is the product (an illicit row from step 35 counts 7.6; a licit row from step 15 counts 0.25). It is passed to the model as </w:t>
+      </w:r>
+      <w:r>
+        <w:rPr>
+          <w:rFonts w:ascii="Consolas" w:cs="Consolas" w:eastAsia="Consolas" w:hAnsi="Consolas"/>
+          <w:sz w:val="20"/>
+          <w:szCs w:val="20"/>
+        </w:rPr>
+        <w:t xml:space="preserve">sample_weight</w:t>
+      </w:r>
+      <w:r>
+        <w:t xml:space="preserve">, which multiplies that row's error in the training loss, so the model concentrates on getting illicit and recent transactions right. LightGBM and the MLP used the same weights. A half-life of 10 clearly beat no weighting (0.881 vs. 0.854) and half-lives of 5, 20 and 40 (Figure 1), and raised the leaderboard score from 0.940 to 0.949, the largest single gain of the project.</w:t>
       </w:r>
     </w:p>
     <w:p>

</xml_diff>

<commit_message>
Report: say which split each recency anchor T belongs to
Co-Authored-By: Claude Opus 5.5 <noreply@anthropic.com>
</commit_message>
<xml_diff>
--- a/report/BT4012_Report.docx
+++ b/report/BT4012_Report.docx
@@ -41,7 +41,7 @@
         </w:rPr>
         <w:t xml:space="preserve">Code: </w:t>
       </w:r>
-      <w:hyperlink w:history="1" r:id="rIdsdvdklqgpedtzgjlhp2dl">
+      <w:hyperlink w:history="1" r:id="rIdjbjweyxmy5egsoxlfihl9">
         <w:r>
           <w:rPr>
             <w:rStyle w:val="Hyperlink"/>
@@ -435,7 +435,7 @@
         <w:t xml:space="preserve">Recency weight</w:t>
       </w:r>
       <w:r>
-        <w:t xml:space="preserve"> w = 0.5^((T − t)/h), where t is the time step the transaction belongs to, T is the latest time step in the training data (35 for the final model; 30 or 20 on the validation splits) and h is the half-life. A row from step T gets weight 1, and the weight halves every h steps further back: with h = 10 and T = 35, a row from step 25 gets 0.5 and one from step 15 gets 0.25. Because fraud patterns drift, recent labels are the best guide to the test period, but older rows still carry signal, so we down-weight rather than drop them.</w:t>
+        <w:t xml:space="preserve"> w = 0.5^((T − t)/h), where t is the time step the transaction belongs to, T is the latest time step in the training data (35 for the final model; 30 on the adjacent split and 20 on the gap-matched split) and h is the half-life. A row from step T gets weight 1, and the weight halves every h steps further back: with h = 10 and T = 35, a row from step 25 gets 0.5 and one from step 15 gets 0.25. Because fraud patterns drift, recent labels are the best guide to the test period, but older rows still carry signal, so we down-weight rather than drop them.</w:t>
       </w:r>
     </w:p>
     <w:p>

</xml_diff>

<commit_message>
Report: describe tuning as it happened (settings rank 18th on the final grid)
Co-Authored-By: Claude Opus 5.5 <noreply@anthropic.com>
</commit_message>
<xml_diff>
--- a/report/BT4012_Report.docx
+++ b/report/BT4012_Report.docx
@@ -41,7 +41,7 @@
         </w:rPr>
         <w:t xml:space="preserve">Code: </w:t>
       </w:r>
-      <w:hyperlink w:history="1" r:id="rIdjbjweyxmy5egsoxlfihl9">
+      <w:hyperlink w:history="1" r:id="rIdgctcx42batgzkbnobmndk">
         <w:r>
           <w:rPr>
             <w:rStyle w:val="Hyperlink"/>
@@ -530,29 +530,7 @@
         <w:t xml:space="preserve">Step 3: Hyperparameter tuning and overfitting control.</w:t>
       </w:r>
       <w:r>
-        <w:t xml:space="preserve"> We trained XGBoost with every combination of tree depth {4, 6, 8}, learning rate {0.05, 0.1, 0.2}, row and column sampling {0.7, 1.0} and L2 penalty {1, 5} (72 configurations, 300 trees each) and kept the best on the gap-matched split. The winner is shallow and strongly regularised: </w:t>
-      </w:r>
-      <w:r>
-        <w:rPr>
-          <w:rFonts w:ascii="Consolas" w:cs="Consolas" w:eastAsia="Consolas" w:hAnsi="Consolas"/>
-          <w:sz w:val="20"/>
-          <w:szCs w:val="20"/>
-        </w:rPr>
-        <w:t xml:space="preserve">max_depth=4</w:t>
-      </w:r>
-      <w:r>
-        <w:t xml:space="preserve">, learning rate 0.1, 70% of features per tree and </w:t>
-      </w:r>
-      <w:r>
-        <w:rPr>
-          <w:rFonts w:ascii="Consolas" w:cs="Consolas" w:eastAsia="Consolas" w:hAnsi="Consolas"/>
-          <w:sz w:val="20"/>
-          <w:szCs w:val="20"/>
-        </w:rPr>
-        <w:t xml:space="preserve">reg_lambda=5</w:t>
-      </w:r>
-      <w:r>
-        <w:t xml:space="preserve">. Shallow trees, the L2 penalty and column sampling all limit how closely the model can fit the training period. When we later re-ran the grid on the final feature set, it preferred a less regularised model (0.900 vs. 0.881), but that model scored lower on the leaderboard (0.94936 vs. 0.95430). We kept the regularised settings and stopped acting on small validation gains alone.</w:t>
+        <w:t xml:space="preserve"> Our XGBoost settings came from a first tuning round, before the graph features were added: depth 4, learning rate 0.1, 70% of features per tree and L2 penalty 5. Adding features can change which settings work best, so on the final 85 features we re-ran the full grid on the gap-matched split: every combination of tree depth {4, 6, 8}, learning rate {0.05, 0.1, 0.2}, fraction of rows and of features per tree {0.7, 1.0} and L2 penalty {1, 5} (72 setups, 300 trees each). The top setup was less regularised (learning rate 0.2, all features per tree, L2 penalty 1) and scored 0.900, against 0.881 for our settings, which ranked 18th. On the leaderboard, however, it scored lower (0.94936 vs. 0.95430), so we kept our settings. Shallow trees, the L2 penalty and feature sampling all limit how closely the model can fit the training period, which matters when the test period drifts. Picking the best of 72 scores on one window of about 4,900 rows favours setups that suit that window's quirks, so from then on we required the leaderboard to confirm small validation gains.</w:t>
       </w:r>
     </w:p>
     <w:p>

</xml_diff>